<commit_message>
Use real CDX tenant users directly; remove profile mapping
Co-authored-by: Copilot <223556219+Copilot@users.noreply.github.com>
Copilot-Session: 91e57aab-4107-4707-97d7-02508420b523
</commit_message>
<xml_diff>
--- a/agent-builder-copilot/Contoso_Fargo_Safety_Handbook.docx
+++ b/agent-builder-copilot/Contoso_Fargo_Safety_Handbook.docx
@@ -122,7 +122,7 @@
           </w:tcPr>
           <w:p>
             <w:r>
-              <w:t>Do not reset the panel. Wait for Anne Weiler or Facility.</w:t>
+              <w:t>Do not reset the panel. Wait for Sonia Rees or Facility.</w:t>
             </w:r>
           </w:p>
         </w:tc>
@@ -212,7 +212,7 @@
     </w:p>
     <w:p>
       <w:r>
-        <w:t>Northwind's April 29 slot is the only early-arrival exception in the demo schedule. If Safety does not approve it, ask Megan Bowen to move the arrival to the regular carrier window.</w:t>
+        <w:t>Northwind's April 29 slot is the only early-arrival exception in the demo schedule. If Safety does not approve it, ask Lisa Taylor to move the arrival to the regular carrier window.</w:t>
       </w:r>
     </w:p>
     <w:p>
@@ -240,7 +240,7 @@
     </w:p>
     <w:p>
       <w:r>
-        <w:t>All 12 shift leads must complete training before June 12. Anne Weiler owns safety content; Megan Bowen owns carrier and dock slot questions.</w:t>
+        <w:t>All 12 shift leads must complete training before June 12. Sonia Rees owns safety content; Lisa Taylor owns carrier and dock slot questions.</w:t>
       </w:r>
     </w:p>
     <w:p>
@@ -294,7 +294,7 @@
     </w:p>
     <w:p>
       <w:r>
-        <w:t>Northwind darf am 29. April nur mit Safety-Ausnahme um 5:30 Uhr kommen. Ohne Ausnahme muss Megan Bowen den Slot verlegen.</w:t>
+        <w:t>Northwind darf am 29. April nur mit Safety-Ausnahme um 5:30 Uhr kommen. Ohne Ausnahme muss Lisa Taylor den Slot verlegen.</w:t>
       </w:r>
     </w:p>
     <w:p>
@@ -307,7 +307,7 @@
     </w:p>
     <w:p>
       <w:r>
-        <w:t>Megan Bowen: Logistik, Dock-Slots und Speditionen. Anne Weiler: Sicherheit, Training, Evakuierung. Riley Johnson: Bau und Sperrungen. Alex Wilber: IT, Scanner und WLAN.</w:t>
+        <w:t>Lisa Taylor: Logistik, Dock-Slots und Speditionen. Sonia Rees: Sicherheit, Training, Evakuierung. Kai Carter: Bau und Sperrungen. Alex Weyer: IT, Scanner und WLAN.</w:t>
       </w:r>
     </w:p>
     <w:sectPr>

</xml_diff>

<commit_message>
Recast to CDX users with a mailbox; guard against look-alike mailboxes; desktop log for every run
Co-authored-by: Copilot <223556219+Copilot@users.noreply.github.com>
Copilot-Session: 91e57aab-4107-4707-97d7-02508420b523
</commit_message>
<xml_diff>
--- a/agent-builder-copilot/Contoso_Fargo_Safety_Handbook.docx
+++ b/agent-builder-copilot/Contoso_Fargo_Safety_Handbook.docx
@@ -212,7 +212,7 @@
     </w:p>
     <w:p>
       <w:r>
-        <w:t>Northwind's April 29 slot is the only early-arrival exception in the demo schedule. If Safety does not approve it, ask Lisa Taylor to move the arrival to the regular carrier window.</w:t>
+        <w:t>Northwind's April 29 slot is the only early-arrival exception in the demo schedule. If Safety does not approve it, ask Teresa Sac to move the arrival to the regular carrier window.</w:t>
       </w:r>
     </w:p>
     <w:p>
@@ -240,7 +240,7 @@
     </w:p>
     <w:p>
       <w:r>
-        <w:t>All 12 shift leads must complete training before June 12. Sonia Rees owns safety content; Lisa Taylor owns carrier and dock slot questions.</w:t>
+        <w:t>All 12 shift leads must complete training before June 12. Sonia Rees owns safety content; Teresa Sac owns carrier and dock slot questions.</w:t>
       </w:r>
     </w:p>
     <w:p>
@@ -294,7 +294,7 @@
     </w:p>
     <w:p>
       <w:r>
-        <w:t>Northwind darf am 29. April nur mit Safety-Ausnahme um 5:30 Uhr kommen. Ohne Ausnahme muss Lisa Taylor den Slot verlegen.</w:t>
+        <w:t>Northwind darf am 29. April nur mit Safety-Ausnahme um 5:30 Uhr kommen. Ohne Ausnahme muss Teresa Sac den Slot verlegen.</w:t>
       </w:r>
     </w:p>
     <w:p>
@@ -307,7 +307,7 @@
     </w:p>
     <w:p>
       <w:r>
-        <w:t>Lisa Taylor: Logistik, Dock-Slots und Speditionen. Sonia Rees: Sicherheit, Training, Evakuierung. Kai Carter: Bau und Sperrungen. Alex Weyer: IT, Scanner und WLAN.</w:t>
+        <w:t>Teresa Sac: Logistik, Dock-Slots und Speditionen. Sonia Rees: Sicherheit, Training, Evakuierung. Vance DeLeon: Bau und Sperrungen. Billie Vester: IT, Scanner und WLAN.</w:t>
       </w:r>
     </w:p>
     <w:sectPr>

</xml_diff>